<commit_message>
feat: reportes ordenados por AL, fecha actual con calendario y limpieza del ingreso rapido
- Reportes: tarjetas ordenadas de AL9 a AL23
- Campos "Lugar y fecha" precargados con la fecha actual (editables) y boton
  de calendario que reescribe la fecha conservando el lugar
- Ingreso rapido: boton "Limpiar datos" con confirmacion y endpoints DELETE
- Ajustes en las plantillas AL16 y AL19

Co-Authored-By: Claude Opus 5.5 <noreply@anthropic.com>
</commit_message>
<xml_diff>
--- a/backend/templates/AL16CERTIFICADOPROMOCION.docx
+++ b/backend/templates/AL16CERTIFICADOPROMOCION.docx
@@ -95,15 +95,6 @@
         </w:rPr>
         <w:t xml:space="preserve"> JUNTA NACIONAL DE DEFENSA DEL ARTESANO</w:t>
       </w:r>
-    </w:p>
-    <w:p>
-      <w:pPr>
-        <w:pStyle w:val="Ttulo9"/>
-        <w:rPr>
-          <w:sz w:val="20"/>
-          <w:szCs w:val="20"/>
-        </w:rPr>
-      </w:pPr>
       <w:r>
         <w:rPr>
           <w:noProof/>
@@ -361,7 +352,7 @@
         </w:trPr>
         <w:tc>
           <w:tcPr>
-            <w:tcW w:w="10232" w:type="dxa"/>
+            <w:tcW w:w="10082" w:type="dxa"/>
             <w:tcBorders>
               <w:top w:val="single" w:sz="4" w:space="0" w:color="auto"/>
               <w:left w:val="single" w:sz="4" w:space="0" w:color="auto"/>
@@ -404,7 +395,7 @@
       <w:tr>
         <w:tc>
           <w:tcPr>
-            <w:tcW w:w="10232" w:type="dxa"/>
+            <w:tcW w:w="10082" w:type="dxa"/>
             <w:tcBorders>
               <w:top w:val="single" w:sz="4" w:space="0" w:color="auto"/>
               <w:left w:val="nil"/>
@@ -1524,207 +1515,235 @@
         <w:pStyle w:val="Textoindependiente"/>
         <w:spacing w:line="240" w:lineRule="auto"/>
         <w:rPr>
-          <w:sz w:val="20"/>
-          <w:szCs w:val="20"/>
+          <w:sz w:val="18"/>
+          <w:szCs w:val="18"/>
         </w:rPr>
       </w:pPr>
       <w:r>
         <w:rPr>
           <w:color w:val="auto"/>
-          <w:sz w:val="20"/>
-          <w:szCs w:val="20"/>
+          <w:sz w:val="18"/>
+          <w:szCs w:val="18"/>
         </w:rPr>
         <w:t xml:space="preserve">De la </w:t>
       </w:r>
       <w:r>
         <w:rPr>
           <w:color w:val="auto"/>
-          <w:sz w:val="20"/>
-          <w:szCs w:val="20"/>
+          <w:sz w:val="18"/>
+          <w:szCs w:val="18"/>
         </w:rPr>
         <w:t>jornada:</w:t>
       </w:r>
       <w:r>
         <w:rPr>
           <w:color w:val="auto"/>
-          <w:sz w:val="20"/>
-          <w:szCs w:val="20"/>
+          <w:sz w:val="18"/>
+          <w:szCs w:val="18"/>
         </w:rPr>
         <w:t xml:space="preserve"> </w:t>
       </w:r>
       <w:r>
         <w:rPr>
           <w:color w:val="auto"/>
-          <w:sz w:val="20"/>
-          <w:szCs w:val="20"/>
+          <w:sz w:val="18"/>
+          <w:szCs w:val="18"/>
         </w:rPr>
         <w:t>{jornada}</w:t>
       </w:r>
       <w:r>
         <w:rPr>
           <w:color w:val="auto"/>
-          <w:sz w:val="20"/>
-          <w:szCs w:val="20"/>
+          <w:sz w:val="18"/>
+          <w:szCs w:val="18"/>
         </w:rPr>
         <w:t xml:space="preserve"> </w:t>
       </w:r>
       <w:r>
         <w:rPr>
           <w:color w:val="auto"/>
-          <w:sz w:val="20"/>
-          <w:szCs w:val="20"/>
+          <w:sz w:val="18"/>
+          <w:szCs w:val="18"/>
         </w:rPr>
         <w:t>ha</w:t>
       </w:r>
       <w:r>
         <w:rPr>
           <w:color w:val="auto"/>
-          <w:sz w:val="20"/>
-          <w:szCs w:val="20"/>
+          <w:sz w:val="18"/>
+          <w:szCs w:val="18"/>
         </w:rPr>
         <w:t xml:space="preserve"> merecido las calificaciones finales que al pie se expresan de conformidad con el </w:t>
       </w:r>
       <w:r>
         <w:rPr>
           <w:color w:val="auto"/>
-          <w:sz w:val="20"/>
-          <w:szCs w:val="20"/>
+          <w:sz w:val="18"/>
+          <w:szCs w:val="18"/>
         </w:rPr>
         <w:t xml:space="preserve">artículo 17 letra c) </w:t>
       </w:r>
       <w:r>
         <w:rPr>
           <w:color w:val="auto"/>
-          <w:sz w:val="20"/>
-          <w:szCs w:val="20"/>
+          <w:sz w:val="18"/>
+          <w:szCs w:val="18"/>
         </w:rPr>
         <w:t>del Reglamento de Formación y Titulación Artesanal</w:t>
       </w:r>
       <w:r>
         <w:rPr>
           <w:color w:val="auto"/>
-          <w:sz w:val="20"/>
-          <w:szCs w:val="20"/>
+          <w:sz w:val="18"/>
+          <w:szCs w:val="18"/>
         </w:rPr>
         <w:t xml:space="preserve"> para las y los Maestros de Taller de los Centros de Formación Artesanal</w:t>
       </w:r>
       <w:r>
         <w:rPr>
           <w:color w:val="auto"/>
-          <w:sz w:val="20"/>
-          <w:szCs w:val="20"/>
+          <w:sz w:val="18"/>
+          <w:szCs w:val="18"/>
         </w:rPr>
         <w:t xml:space="preserve">, que </w:t>
       </w:r>
       <w:r>
         <w:rPr>
           <w:color w:val="auto"/>
-          <w:sz w:val="20"/>
-          <w:szCs w:val="20"/>
-        </w:rPr>
-        <w:t>{loLa}</w:t>
-      </w:r>
+          <w:sz w:val="18"/>
+          <w:szCs w:val="18"/>
+        </w:rPr>
+        <w:t>{</w:t>
+      </w:r>
+      <w:proofErr w:type="spellStart"/>
       <w:r>
         <w:rPr>
           <w:color w:val="auto"/>
-          <w:sz w:val="20"/>
-          <w:szCs w:val="20"/>
+          <w:sz w:val="18"/>
+          <w:szCs w:val="18"/>
+        </w:rPr>
+        <w:t>loLa</w:t>
+      </w:r>
+      <w:proofErr w:type="spellEnd"/>
+      <w:r>
+        <w:rPr>
+          <w:color w:val="auto"/>
+          <w:sz w:val="18"/>
+          <w:szCs w:val="18"/>
+        </w:rPr>
+        <w:t>}</w:t>
+      </w:r>
+      <w:r>
+        <w:rPr>
+          <w:color w:val="auto"/>
+          <w:sz w:val="18"/>
+          <w:szCs w:val="18"/>
         </w:rPr>
         <w:t xml:space="preserve"> acreditan </w:t>
       </w:r>
       <w:r>
         <w:rPr>
           <w:color w:val="auto"/>
-          <w:sz w:val="20"/>
-          <w:szCs w:val="20"/>
+          <w:sz w:val="18"/>
+          <w:szCs w:val="18"/>
         </w:rPr>
         <w:t>haber terminado el AÑO FORMATIVO</w:t>
       </w:r>
       <w:r>
         <w:rPr>
           <w:color w:val="auto"/>
-          <w:sz w:val="20"/>
-          <w:szCs w:val="20"/>
+          <w:sz w:val="18"/>
+          <w:szCs w:val="18"/>
         </w:rPr>
         <w:t xml:space="preserve"> {AF1}</w:t>
       </w:r>
       <w:r>
         <w:rPr>
           <w:color w:val="auto"/>
-          <w:sz w:val="20"/>
-          <w:szCs w:val="20"/>
+          <w:sz w:val="18"/>
+          <w:szCs w:val="18"/>
         </w:rPr>
         <w:t xml:space="preserve"> </w:t>
       </w:r>
       <w:r>
         <w:rPr>
           <w:color w:val="auto"/>
-          <w:sz w:val="20"/>
-          <w:szCs w:val="20"/>
+          <w:sz w:val="18"/>
+          <w:szCs w:val="18"/>
         </w:rPr>
         <w:t>–</w:t>
       </w:r>
       <w:r>
         <w:rPr>
           <w:color w:val="auto"/>
-          <w:sz w:val="20"/>
-          <w:szCs w:val="20"/>
+          <w:sz w:val="18"/>
+          <w:szCs w:val="18"/>
         </w:rPr>
         <w:t xml:space="preserve"> </w:t>
       </w:r>
       <w:r>
         <w:rPr>
           <w:color w:val="auto"/>
-          <w:sz w:val="20"/>
-          <w:szCs w:val="20"/>
+          <w:sz w:val="18"/>
+          <w:szCs w:val="18"/>
         </w:rPr>
         <w:t>{AF2</w:t>
       </w:r>
       <w:r>
         <w:rPr>
           <w:color w:val="auto"/>
-          <w:sz w:val="20"/>
-          <w:szCs w:val="20"/>
+          <w:sz w:val="18"/>
+          <w:szCs w:val="18"/>
+        </w:rPr>
+        <w:t>},</w:t>
+      </w:r>
+      <w:r>
+        <w:rPr>
+          <w:color w:val="auto"/>
+          <w:sz w:val="18"/>
+          <w:szCs w:val="18"/>
+        </w:rPr>
+        <w:t xml:space="preserve"> en la RAMA ARTESANAL DE: </w:t>
+      </w:r>
+      <w:r>
+        <w:rPr>
+          <w:color w:val="auto"/>
+          <w:sz w:val="18"/>
+          <w:szCs w:val="18"/>
+        </w:rPr>
+        <w:t>{</w:t>
+      </w:r>
+      <w:proofErr w:type="spellStart"/>
+      <w:r>
+        <w:rPr>
+          <w:color w:val="auto"/>
+          <w:sz w:val="18"/>
+          <w:szCs w:val="18"/>
+        </w:rPr>
+        <w:t>raArt</w:t>
+      </w:r>
+      <w:proofErr w:type="spellEnd"/>
+      <w:r>
+        <w:rPr>
+          <w:color w:val="auto"/>
+          <w:sz w:val="18"/>
+          <w:szCs w:val="18"/>
         </w:rPr>
         <w:t>}</w:t>
       </w:r>
       <w:r>
         <w:rPr>
           <w:color w:val="auto"/>
-          <w:sz w:val="20"/>
-          <w:szCs w:val="20"/>
-        </w:rPr>
-        <w:t>,</w:t>
+          <w:sz w:val="18"/>
+          <w:szCs w:val="18"/>
+        </w:rPr>
+        <w:t xml:space="preserve">, </w:t>
       </w:r>
       <w:r>
         <w:rPr>
           <w:color w:val="auto"/>
-          <w:sz w:val="20"/>
-          <w:szCs w:val="20"/>
-        </w:rPr>
-        <w:t xml:space="preserve"> en la RAMA ARTESANAL DE: </w:t>
-      </w:r>
-      <w:r>
-        <w:rPr>
-          <w:color w:val="auto"/>
-          <w:sz w:val="20"/>
-          <w:szCs w:val="20"/>
-        </w:rPr>
-        <w:t>{raArt}</w:t>
-      </w:r>
-      <w:r>
-        <w:rPr>
-          <w:color w:val="auto"/>
-          <w:sz w:val="20"/>
-          <w:szCs w:val="20"/>
-        </w:rPr>
-        <w:t xml:space="preserve">, </w:t>
-      </w:r>
-      <w:r>
-        <w:rPr>
-          <w:color w:val="auto"/>
-          <w:sz w:val="20"/>
-          <w:szCs w:val="20"/>
+          <w:sz w:val="18"/>
+          <w:szCs w:val="18"/>
         </w:rPr>
         <w:t>como</w:t>
       </w:r>
@@ -1732,56 +1751,56 @@
         <w:rPr>
           <w:b/>
           <w:color w:val="auto"/>
-          <w:sz w:val="20"/>
-          <w:szCs w:val="20"/>
+          <w:sz w:val="18"/>
+          <w:szCs w:val="18"/>
         </w:rPr>
         <w:t xml:space="preserve"> </w:t>
       </w:r>
       <w:r>
         <w:rPr>
           <w:color w:val="auto"/>
-          <w:sz w:val="20"/>
-          <w:szCs w:val="20"/>
+          <w:sz w:val="18"/>
+          <w:szCs w:val="18"/>
         </w:rPr>
         <w:t>consta en los archivos de esta Institución, a los cuales me remito</w:t>
       </w:r>
       <w:r>
         <w:rPr>
           <w:color w:val="auto"/>
-          <w:sz w:val="20"/>
-          <w:szCs w:val="20"/>
+          <w:sz w:val="18"/>
+          <w:szCs w:val="18"/>
         </w:rPr>
         <w:t>.</w:t>
       </w:r>
       <w:r>
         <w:rPr>
           <w:color w:val="auto"/>
-          <w:sz w:val="20"/>
-          <w:szCs w:val="20"/>
+          <w:sz w:val="18"/>
+          <w:szCs w:val="18"/>
         </w:rPr>
         <w:t xml:space="preserve"> </w:t>
       </w:r>
       <w:r>
         <w:rPr>
           <w:color w:val="auto"/>
-          <w:sz w:val="20"/>
-          <w:szCs w:val="20"/>
+          <w:sz w:val="18"/>
+          <w:szCs w:val="18"/>
         </w:rPr>
         <w:t>{prefijo}</w:t>
       </w:r>
       <w:r>
         <w:rPr>
           <w:color w:val="auto"/>
-          <w:sz w:val="20"/>
-          <w:szCs w:val="20"/>
+          <w:sz w:val="18"/>
+          <w:szCs w:val="18"/>
         </w:rPr>
         <w:t xml:space="preserve"> participante ha obtenido las siguientes calificaciones</w:t>
       </w:r>
       <w:r>
         <w:rPr>
           <w:color w:val="auto"/>
-          <w:sz w:val="20"/>
-          <w:szCs w:val="20"/>
+          <w:sz w:val="18"/>
+          <w:szCs w:val="18"/>
         </w:rPr>
         <w:t>:</w:t>
       </w:r>
@@ -2115,7 +2134,29 @@
                 <w:sz w:val="16"/>
                 <w:szCs w:val="16"/>
               </w:rPr>
-              <w:t>{teoria}</w:t>
+              <w:t>{</w:t>
+            </w:r>
+            <w:proofErr w:type="spellStart"/>
+            <w:r>
+              <w:rPr>
+                <w:rFonts w:ascii="Arial" w:hAnsi="Arial" w:cs="Arial"/>
+                <w:b/>
+                <w:bCs/>
+                <w:sz w:val="16"/>
+                <w:szCs w:val="16"/>
+              </w:rPr>
+              <w:t>teoria</w:t>
+            </w:r>
+            <w:proofErr w:type="spellEnd"/>
+            <w:r>
+              <w:rPr>
+                <w:rFonts w:ascii="Arial" w:hAnsi="Arial" w:cs="Arial"/>
+                <w:b/>
+                <w:bCs/>
+                <w:sz w:val="16"/>
+                <w:szCs w:val="16"/>
+              </w:rPr>
+              <w:t>}</w:t>
             </w:r>
           </w:p>
         </w:tc>
@@ -2146,7 +2187,27 @@
                 <w:sz w:val="16"/>
                 <w:szCs w:val="16"/>
               </w:rPr>
-              <w:t>{teoriaL}</w:t>
+              <w:t>{</w:t>
+            </w:r>
+            <w:proofErr w:type="spellStart"/>
+            <w:r>
+              <w:rPr>
+                <w:rFonts w:ascii="Arial" w:hAnsi="Arial" w:cs="Arial"/>
+                <w:bCs/>
+                <w:sz w:val="16"/>
+                <w:szCs w:val="16"/>
+              </w:rPr>
+              <w:t>teoriaL</w:t>
+            </w:r>
+            <w:proofErr w:type="spellEnd"/>
+            <w:r>
+              <w:rPr>
+                <w:rFonts w:ascii="Arial" w:hAnsi="Arial" w:cs="Arial"/>
+                <w:bCs/>
+                <w:sz w:val="16"/>
+                <w:szCs w:val="16"/>
+              </w:rPr>
+              <w:t>}</w:t>
             </w:r>
           </w:p>
         </w:tc>
@@ -2200,7 +2261,29 @@
                 <w:sz w:val="16"/>
                 <w:szCs w:val="16"/>
               </w:rPr>
-              <w:t>{teoE}</w:t>
+              <w:t>{</w:t>
+            </w:r>
+            <w:proofErr w:type="spellStart"/>
+            <w:r>
+              <w:rPr>
+                <w:rFonts w:ascii="Arial" w:hAnsi="Arial" w:cs="Arial"/>
+                <w:b/>
+                <w:bCs/>
+                <w:sz w:val="16"/>
+                <w:szCs w:val="16"/>
+              </w:rPr>
+              <w:t>teoE</w:t>
+            </w:r>
+            <w:proofErr w:type="spellEnd"/>
+            <w:r>
+              <w:rPr>
+                <w:rFonts w:ascii="Arial" w:hAnsi="Arial" w:cs="Arial"/>
+                <w:b/>
+                <w:bCs/>
+                <w:sz w:val="16"/>
+                <w:szCs w:val="16"/>
+              </w:rPr>
+              <w:t>}</w:t>
             </w:r>
           </w:p>
         </w:tc>
@@ -2319,7 +2402,27 @@
                 <w:sz w:val="16"/>
                 <w:szCs w:val="16"/>
               </w:rPr>
-              <w:t>{practicaL}</w:t>
+              <w:t>{</w:t>
+            </w:r>
+            <w:proofErr w:type="spellStart"/>
+            <w:r>
+              <w:rPr>
+                <w:rFonts w:ascii="Arial" w:hAnsi="Arial" w:cs="Arial"/>
+                <w:bCs/>
+                <w:sz w:val="16"/>
+                <w:szCs w:val="16"/>
+              </w:rPr>
+              <w:t>practicaL</w:t>
+            </w:r>
+            <w:proofErr w:type="spellEnd"/>
+            <w:r>
+              <w:rPr>
+                <w:rFonts w:ascii="Arial" w:hAnsi="Arial" w:cs="Arial"/>
+                <w:bCs/>
+                <w:sz w:val="16"/>
+                <w:szCs w:val="16"/>
+              </w:rPr>
+              <w:t>}</w:t>
             </w:r>
           </w:p>
         </w:tc>
@@ -2373,7 +2476,29 @@
                 <w:sz w:val="16"/>
                 <w:szCs w:val="16"/>
               </w:rPr>
-              <w:t>{pracE}</w:t>
+              <w:t>{</w:t>
+            </w:r>
+            <w:proofErr w:type="spellStart"/>
+            <w:r>
+              <w:rPr>
+                <w:rFonts w:ascii="Arial" w:hAnsi="Arial" w:cs="Arial"/>
+                <w:b/>
+                <w:bCs/>
+                <w:sz w:val="16"/>
+                <w:szCs w:val="16"/>
+              </w:rPr>
+              <w:t>pracE</w:t>
+            </w:r>
+            <w:proofErr w:type="spellEnd"/>
+            <w:r>
+              <w:rPr>
+                <w:rFonts w:ascii="Arial" w:hAnsi="Arial" w:cs="Arial"/>
+                <w:b/>
+                <w:bCs/>
+                <w:sz w:val="16"/>
+                <w:szCs w:val="16"/>
+              </w:rPr>
+              <w:t>}</w:t>
             </w:r>
           </w:p>
         </w:tc>
@@ -2461,7 +2586,29 @@
                 <w:sz w:val="16"/>
                 <w:szCs w:val="16"/>
               </w:rPr>
-              <w:t>{administracion}</w:t>
+              <w:t>{</w:t>
+            </w:r>
+            <w:proofErr w:type="spellStart"/>
+            <w:r>
+              <w:rPr>
+                <w:rFonts w:ascii="Arial" w:hAnsi="Arial" w:cs="Arial"/>
+                <w:b/>
+                <w:bCs/>
+                <w:sz w:val="16"/>
+                <w:szCs w:val="16"/>
+              </w:rPr>
+              <w:t>administracion</w:t>
+            </w:r>
+            <w:proofErr w:type="spellEnd"/>
+            <w:r>
+              <w:rPr>
+                <w:rFonts w:ascii="Arial" w:hAnsi="Arial" w:cs="Arial"/>
+                <w:b/>
+                <w:bCs/>
+                <w:sz w:val="16"/>
+                <w:szCs w:val="16"/>
+              </w:rPr>
+              <w:t>}</w:t>
             </w:r>
           </w:p>
         </w:tc>
@@ -2492,7 +2639,27 @@
                 <w:sz w:val="16"/>
                 <w:szCs w:val="16"/>
               </w:rPr>
-              <w:t>{administracionL}</w:t>
+              <w:t>{</w:t>
+            </w:r>
+            <w:proofErr w:type="spellStart"/>
+            <w:r>
+              <w:rPr>
+                <w:rFonts w:ascii="Arial" w:hAnsi="Arial" w:cs="Arial"/>
+                <w:bCs/>
+                <w:sz w:val="16"/>
+                <w:szCs w:val="16"/>
+              </w:rPr>
+              <w:t>administracionL</w:t>
+            </w:r>
+            <w:proofErr w:type="spellEnd"/>
+            <w:r>
+              <w:rPr>
+                <w:rFonts w:ascii="Arial" w:hAnsi="Arial" w:cs="Arial"/>
+                <w:bCs/>
+                <w:sz w:val="16"/>
+                <w:szCs w:val="16"/>
+              </w:rPr>
+              <w:t>}</w:t>
             </w:r>
           </w:p>
         </w:tc>
@@ -2546,7 +2713,29 @@
                 <w:sz w:val="16"/>
                 <w:szCs w:val="16"/>
               </w:rPr>
-              <w:t>{admE}</w:t>
+              <w:t>{</w:t>
+            </w:r>
+            <w:proofErr w:type="spellStart"/>
+            <w:r>
+              <w:rPr>
+                <w:rFonts w:ascii="Arial" w:hAnsi="Arial" w:cs="Arial"/>
+                <w:b/>
+                <w:bCs/>
+                <w:sz w:val="16"/>
+                <w:szCs w:val="16"/>
+              </w:rPr>
+              <w:t>admE</w:t>
+            </w:r>
+            <w:proofErr w:type="spellEnd"/>
+            <w:r>
+              <w:rPr>
+                <w:rFonts w:ascii="Arial" w:hAnsi="Arial" w:cs="Arial"/>
+                <w:b/>
+                <w:bCs/>
+                <w:sz w:val="16"/>
+                <w:szCs w:val="16"/>
+              </w:rPr>
+              <w:t>}</w:t>
             </w:r>
           </w:p>
         </w:tc>
@@ -2665,7 +2854,27 @@
                 <w:sz w:val="16"/>
                 <w:szCs w:val="16"/>
               </w:rPr>
-              <w:t>{contabilidadL}</w:t>
+              <w:t>{</w:t>
+            </w:r>
+            <w:proofErr w:type="spellStart"/>
+            <w:r>
+              <w:rPr>
+                <w:rFonts w:ascii="Arial" w:hAnsi="Arial" w:cs="Arial"/>
+                <w:bCs/>
+                <w:sz w:val="16"/>
+                <w:szCs w:val="16"/>
+              </w:rPr>
+              <w:t>contabilidadL</w:t>
+            </w:r>
+            <w:proofErr w:type="spellEnd"/>
+            <w:r>
+              <w:rPr>
+                <w:rFonts w:ascii="Arial" w:hAnsi="Arial" w:cs="Arial"/>
+                <w:bCs/>
+                <w:sz w:val="16"/>
+                <w:szCs w:val="16"/>
+              </w:rPr>
+              <w:t>}</w:t>
             </w:r>
           </w:p>
         </w:tc>
@@ -2719,7 +2928,29 @@
                 <w:sz w:val="16"/>
                 <w:szCs w:val="16"/>
               </w:rPr>
-              <w:t>{conE}</w:t>
+              <w:t>{</w:t>
+            </w:r>
+            <w:proofErr w:type="spellStart"/>
+            <w:r>
+              <w:rPr>
+                <w:rFonts w:ascii="Arial" w:hAnsi="Arial" w:cs="Arial"/>
+                <w:b/>
+                <w:bCs/>
+                <w:sz w:val="16"/>
+                <w:szCs w:val="16"/>
+              </w:rPr>
+              <w:t>conE</w:t>
+            </w:r>
+            <w:proofErr w:type="spellEnd"/>
+            <w:r>
+              <w:rPr>
+                <w:rFonts w:ascii="Arial" w:hAnsi="Arial" w:cs="Arial"/>
+                <w:b/>
+                <w:bCs/>
+                <w:sz w:val="16"/>
+                <w:szCs w:val="16"/>
+              </w:rPr>
+              <w:t>}</w:t>
             </w:r>
           </w:p>
         </w:tc>
@@ -2838,7 +3069,27 @@
                 <w:sz w:val="16"/>
                 <w:szCs w:val="16"/>
               </w:rPr>
-              <w:t>{inglesL}</w:t>
+              <w:t>{</w:t>
+            </w:r>
+            <w:proofErr w:type="spellStart"/>
+            <w:r>
+              <w:rPr>
+                <w:rFonts w:ascii="Arial" w:hAnsi="Arial" w:cs="Arial"/>
+                <w:bCs/>
+                <w:sz w:val="16"/>
+                <w:szCs w:val="16"/>
+              </w:rPr>
+              <w:t>inglesL</w:t>
+            </w:r>
+            <w:proofErr w:type="spellEnd"/>
+            <w:r>
+              <w:rPr>
+                <w:rFonts w:ascii="Arial" w:hAnsi="Arial" w:cs="Arial"/>
+                <w:bCs/>
+                <w:sz w:val="16"/>
+                <w:szCs w:val="16"/>
+              </w:rPr>
+              <w:t>}</w:t>
             </w:r>
           </w:p>
         </w:tc>
@@ -2892,7 +3143,29 @@
                 <w:sz w:val="16"/>
                 <w:szCs w:val="16"/>
               </w:rPr>
-              <w:t>{ingE}</w:t>
+              <w:t>{</w:t>
+            </w:r>
+            <w:proofErr w:type="spellStart"/>
+            <w:r>
+              <w:rPr>
+                <w:rFonts w:ascii="Arial" w:hAnsi="Arial" w:cs="Arial"/>
+                <w:b/>
+                <w:bCs/>
+                <w:sz w:val="16"/>
+                <w:szCs w:val="16"/>
+              </w:rPr>
+              <w:t>ingE</w:t>
+            </w:r>
+            <w:proofErr w:type="spellEnd"/>
+            <w:r>
+              <w:rPr>
+                <w:rFonts w:ascii="Arial" w:hAnsi="Arial" w:cs="Arial"/>
+                <w:b/>
+                <w:bCs/>
+                <w:sz w:val="16"/>
+                <w:szCs w:val="16"/>
+              </w:rPr>
+              <w:t>}</w:t>
             </w:r>
           </w:p>
         </w:tc>
@@ -3008,7 +3281,27 @@
                 <w:sz w:val="16"/>
                 <w:szCs w:val="16"/>
               </w:rPr>
-              <w:t>{desarrolloL}</w:t>
+              <w:t>{</w:t>
+            </w:r>
+            <w:proofErr w:type="spellStart"/>
+            <w:r>
+              <w:rPr>
+                <w:rFonts w:ascii="Arial" w:hAnsi="Arial" w:cs="Arial"/>
+                <w:bCs/>
+                <w:sz w:val="16"/>
+                <w:szCs w:val="16"/>
+              </w:rPr>
+              <w:t>desarrolloL</w:t>
+            </w:r>
+            <w:proofErr w:type="spellEnd"/>
+            <w:r>
+              <w:rPr>
+                <w:rFonts w:ascii="Arial" w:hAnsi="Arial" w:cs="Arial"/>
+                <w:bCs/>
+                <w:sz w:val="16"/>
+                <w:szCs w:val="16"/>
+              </w:rPr>
+              <w:t>}</w:t>
             </w:r>
           </w:p>
         </w:tc>
@@ -3062,7 +3355,29 @@
                 <w:sz w:val="16"/>
                 <w:szCs w:val="16"/>
               </w:rPr>
-              <w:t>{desE}</w:t>
+              <w:t>{</w:t>
+            </w:r>
+            <w:proofErr w:type="spellStart"/>
+            <w:r>
+              <w:rPr>
+                <w:rFonts w:ascii="Arial" w:hAnsi="Arial" w:cs="Arial"/>
+                <w:b/>
+                <w:bCs/>
+                <w:sz w:val="16"/>
+                <w:szCs w:val="16"/>
+              </w:rPr>
+              <w:t>desE</w:t>
+            </w:r>
+            <w:proofErr w:type="spellEnd"/>
+            <w:r>
+              <w:rPr>
+                <w:rFonts w:ascii="Arial" w:hAnsi="Arial" w:cs="Arial"/>
+                <w:b/>
+                <w:bCs/>
+                <w:sz w:val="16"/>
+                <w:szCs w:val="16"/>
+              </w:rPr>
+              <w:t>}</w:t>
             </w:r>
           </w:p>
         </w:tc>
@@ -3092,7 +3407,23 @@
                 <w:sz w:val="18"/>
                 <w:szCs w:val="18"/>
               </w:rPr>
-              <w:t xml:space="preserve">-TIC´s </w:t>
+              <w:t>-</w:t>
+            </w:r>
+            <w:proofErr w:type="spellStart"/>
+            <w:r>
+              <w:rPr>
+                <w:sz w:val="18"/>
+                <w:szCs w:val="18"/>
+              </w:rPr>
+              <w:t>TIC´s</w:t>
+            </w:r>
+            <w:proofErr w:type="spellEnd"/>
+            <w:r>
+              <w:rPr>
+                <w:sz w:val="18"/>
+                <w:szCs w:val="18"/>
+              </w:rPr>
+              <w:t xml:space="preserve"> </w:t>
             </w:r>
           </w:p>
         </w:tc>
@@ -3178,7 +3509,27 @@
                 <w:sz w:val="16"/>
                 <w:szCs w:val="16"/>
               </w:rPr>
-              <w:t>{ticsL}</w:t>
+              <w:t>{</w:t>
+            </w:r>
+            <w:proofErr w:type="spellStart"/>
+            <w:r>
+              <w:rPr>
+                <w:rFonts w:ascii="Arial" w:hAnsi="Arial" w:cs="Arial"/>
+                <w:bCs/>
+                <w:sz w:val="16"/>
+                <w:szCs w:val="16"/>
+              </w:rPr>
+              <w:t>ticsL</w:t>
+            </w:r>
+            <w:proofErr w:type="spellEnd"/>
+            <w:r>
+              <w:rPr>
+                <w:rFonts w:ascii="Arial" w:hAnsi="Arial" w:cs="Arial"/>
+                <w:bCs/>
+                <w:sz w:val="16"/>
+                <w:szCs w:val="16"/>
+              </w:rPr>
+              <w:t>}</w:t>
             </w:r>
           </w:p>
         </w:tc>
@@ -3232,7 +3583,29 @@
                 <w:sz w:val="16"/>
                 <w:szCs w:val="16"/>
               </w:rPr>
-              <w:t>{ticsE}</w:t>
+              <w:t>{</w:t>
+            </w:r>
+            <w:proofErr w:type="spellStart"/>
+            <w:r>
+              <w:rPr>
+                <w:rFonts w:ascii="Arial" w:hAnsi="Arial" w:cs="Arial"/>
+                <w:b/>
+                <w:bCs/>
+                <w:sz w:val="16"/>
+                <w:szCs w:val="16"/>
+              </w:rPr>
+              <w:t>ticsE</w:t>
+            </w:r>
+            <w:proofErr w:type="spellEnd"/>
+            <w:r>
+              <w:rPr>
+                <w:rFonts w:ascii="Arial" w:hAnsi="Arial" w:cs="Arial"/>
+                <w:b/>
+                <w:bCs/>
+                <w:sz w:val="16"/>
+                <w:szCs w:val="16"/>
+              </w:rPr>
+              <w:t>}</w:t>
             </w:r>
           </w:p>
         </w:tc>
@@ -3317,7 +3690,29 @@
                 <w:sz w:val="16"/>
                 <w:szCs w:val="16"/>
               </w:rPr>
-              <w:t>{proyect}</w:t>
+              <w:t>{</w:t>
+            </w:r>
+            <w:proofErr w:type="spellStart"/>
+            <w:r>
+              <w:rPr>
+                <w:rFonts w:ascii="Arial" w:hAnsi="Arial" w:cs="Arial"/>
+                <w:b/>
+                <w:bCs/>
+                <w:sz w:val="16"/>
+                <w:szCs w:val="16"/>
+              </w:rPr>
+              <w:t>proyect</w:t>
+            </w:r>
+            <w:proofErr w:type="spellEnd"/>
+            <w:r>
+              <w:rPr>
+                <w:rFonts w:ascii="Arial" w:hAnsi="Arial" w:cs="Arial"/>
+                <w:b/>
+                <w:bCs/>
+                <w:sz w:val="16"/>
+                <w:szCs w:val="16"/>
+              </w:rPr>
+              <w:t>}</w:t>
             </w:r>
           </w:p>
         </w:tc>
@@ -3348,7 +3743,27 @@
                 <w:sz w:val="16"/>
                 <w:szCs w:val="16"/>
               </w:rPr>
-              <w:t>{proyectL}</w:t>
+              <w:t>{</w:t>
+            </w:r>
+            <w:proofErr w:type="spellStart"/>
+            <w:r>
+              <w:rPr>
+                <w:rFonts w:ascii="Arial" w:hAnsi="Arial" w:cs="Arial"/>
+                <w:bCs/>
+                <w:sz w:val="16"/>
+                <w:szCs w:val="16"/>
+              </w:rPr>
+              <w:t>proyectL</w:t>
+            </w:r>
+            <w:proofErr w:type="spellEnd"/>
+            <w:r>
+              <w:rPr>
+                <w:rFonts w:ascii="Arial" w:hAnsi="Arial" w:cs="Arial"/>
+                <w:bCs/>
+                <w:sz w:val="16"/>
+                <w:szCs w:val="16"/>
+              </w:rPr>
+              <w:t>}</w:t>
             </w:r>
           </w:p>
         </w:tc>
@@ -3402,7 +3817,29 @@
                 <w:sz w:val="16"/>
                 <w:szCs w:val="16"/>
               </w:rPr>
-              <w:t>{proyectE}</w:t>
+              <w:t>{</w:t>
+            </w:r>
+            <w:proofErr w:type="spellStart"/>
+            <w:r>
+              <w:rPr>
+                <w:rFonts w:ascii="Arial" w:hAnsi="Arial" w:cs="Arial"/>
+                <w:b/>
+                <w:bCs/>
+                <w:sz w:val="16"/>
+                <w:szCs w:val="16"/>
+              </w:rPr>
+              <w:t>proyectE</w:t>
+            </w:r>
+            <w:proofErr w:type="spellEnd"/>
+            <w:r>
+              <w:rPr>
+                <w:rFonts w:ascii="Arial" w:hAnsi="Arial" w:cs="Arial"/>
+                <w:b/>
+                <w:bCs/>
+                <w:sz w:val="16"/>
+                <w:szCs w:val="16"/>
+              </w:rPr>
+              <w:t>}</w:t>
             </w:r>
           </w:p>
         </w:tc>
@@ -3490,7 +3927,29 @@
                 <w:sz w:val="16"/>
                 <w:szCs w:val="16"/>
               </w:rPr>
-              <w:t>{legislacion}</w:t>
+              <w:t>{</w:t>
+            </w:r>
+            <w:proofErr w:type="spellStart"/>
+            <w:r>
+              <w:rPr>
+                <w:rFonts w:ascii="Arial" w:hAnsi="Arial" w:cs="Arial"/>
+                <w:b/>
+                <w:bCs/>
+                <w:sz w:val="16"/>
+                <w:szCs w:val="16"/>
+              </w:rPr>
+              <w:t>legislacion</w:t>
+            </w:r>
+            <w:proofErr w:type="spellEnd"/>
+            <w:r>
+              <w:rPr>
+                <w:rFonts w:ascii="Arial" w:hAnsi="Arial" w:cs="Arial"/>
+                <w:b/>
+                <w:bCs/>
+                <w:sz w:val="16"/>
+                <w:szCs w:val="16"/>
+              </w:rPr>
+              <w:t>}</w:t>
             </w:r>
           </w:p>
         </w:tc>
@@ -3521,7 +3980,27 @@
                 <w:sz w:val="16"/>
                 <w:szCs w:val="16"/>
               </w:rPr>
-              <w:t>{legislacionL}</w:t>
+              <w:t>{</w:t>
+            </w:r>
+            <w:proofErr w:type="spellStart"/>
+            <w:r>
+              <w:rPr>
+                <w:rFonts w:ascii="Arial" w:hAnsi="Arial" w:cs="Arial"/>
+                <w:bCs/>
+                <w:sz w:val="16"/>
+                <w:szCs w:val="16"/>
+              </w:rPr>
+              <w:t>legislacionL</w:t>
+            </w:r>
+            <w:proofErr w:type="spellEnd"/>
+            <w:r>
+              <w:rPr>
+                <w:rFonts w:ascii="Arial" w:hAnsi="Arial" w:cs="Arial"/>
+                <w:bCs/>
+                <w:sz w:val="16"/>
+                <w:szCs w:val="16"/>
+              </w:rPr>
+              <w:t>}</w:t>
             </w:r>
           </w:p>
         </w:tc>
@@ -3575,7 +4054,29 @@
                 <w:sz w:val="16"/>
                 <w:szCs w:val="16"/>
               </w:rPr>
-              <w:t>{legisE}</w:t>
+              <w:t>{</w:t>
+            </w:r>
+            <w:proofErr w:type="spellStart"/>
+            <w:r>
+              <w:rPr>
+                <w:rFonts w:ascii="Arial" w:hAnsi="Arial" w:cs="Arial"/>
+                <w:b/>
+                <w:bCs/>
+                <w:sz w:val="16"/>
+                <w:szCs w:val="16"/>
+              </w:rPr>
+              <w:t>legisE</w:t>
+            </w:r>
+            <w:proofErr w:type="spellEnd"/>
+            <w:r>
+              <w:rPr>
+                <w:rFonts w:ascii="Arial" w:hAnsi="Arial" w:cs="Arial"/>
+                <w:b/>
+                <w:bCs/>
+                <w:sz w:val="16"/>
+                <w:szCs w:val="16"/>
+              </w:rPr>
+              <w:t>}</w:t>
             </w:r>
           </w:p>
         </w:tc>
@@ -3622,14 +4123,16 @@
               <w:rPr>
                 <w:caps/>
                 <w:color w:val="auto"/>
-                <w:szCs w:val="20"/>
+                <w:sz w:val="18"/>
+                <w:szCs w:val="18"/>
               </w:rPr>
             </w:pPr>
             <w:r>
               <w:rPr>
                 <w:caps/>
                 <w:color w:val="auto"/>
-                <w:szCs w:val="20"/>
+                <w:sz w:val="18"/>
+                <w:szCs w:val="18"/>
               </w:rPr>
               <w:t>dISCIPLINA</w:t>
             </w:r>
@@ -3645,8 +4148,8 @@
                 <w:rFonts w:ascii="Arial" w:hAnsi="Arial" w:cs="Arial"/>
                 <w:b/>
                 <w:caps/>
-                <w:sz w:val="16"/>
-                <w:szCs w:val="16"/>
+                <w:sz w:val="18"/>
+                <w:szCs w:val="18"/>
               </w:rPr>
             </w:pPr>
             <w:r>
@@ -3654,8 +4157,8 @@
                 <w:rFonts w:ascii="Arial" w:hAnsi="Arial" w:cs="Arial"/>
                 <w:b/>
                 <w:caps/>
-                <w:sz w:val="16"/>
-                <w:szCs w:val="16"/>
+                <w:sz w:val="18"/>
+                <w:szCs w:val="18"/>
               </w:rPr>
               <w:t>{disciplina}</w:t>
             </w:r>
@@ -3672,8 +4175,8 @@
                 <w:rFonts w:ascii="Arial" w:hAnsi="Arial" w:cs="Arial"/>
                 <w:b/>
                 <w:caps/>
-                <w:sz w:val="16"/>
-                <w:szCs w:val="16"/>
+                <w:sz w:val="18"/>
+                <w:szCs w:val="18"/>
               </w:rPr>
             </w:pPr>
             <w:r>
@@ -3681,8 +4184,8 @@
                 <w:rFonts w:ascii="Arial" w:hAnsi="Arial" w:cs="Arial"/>
                 <w:b/>
                 <w:caps/>
-                <w:sz w:val="16"/>
-                <w:szCs w:val="16"/>
+                <w:sz w:val="18"/>
+                <w:szCs w:val="18"/>
               </w:rPr>
               <w:t>{disciplinaL}</w:t>
             </w:r>
@@ -3700,16 +4203,16 @@
               <w:rPr>
                 <w:b/>
                 <w:bCs/>
-                <w:sz w:val="20"/>
-                <w:szCs w:val="20"/>
-              </w:rPr>
-            </w:pPr>
-            <w:r>
-              <w:rPr>
-                <w:b/>
-                <w:bCs/>
-                <w:sz w:val="20"/>
-                <w:szCs w:val="20"/>
+                <w:sz w:val="18"/>
+                <w:szCs w:val="18"/>
+              </w:rPr>
+            </w:pPr>
+            <w:r>
+              <w:rPr>
+                <w:b/>
+                <w:bCs/>
+                <w:sz w:val="18"/>
+                <w:szCs w:val="18"/>
               </w:rPr>
               <w:t>PROMEDIO GENERAL</w:t>
             </w:r>
@@ -3724,16 +4227,16 @@
               <w:rPr>
                 <w:rFonts w:ascii="Arial" w:hAnsi="Arial" w:cs="Arial"/>
                 <w:b/>
-                <w:sz w:val="16"/>
-                <w:szCs w:val="16"/>
-              </w:rPr>
-            </w:pPr>
-            <w:r>
-              <w:rPr>
-                <w:rFonts w:ascii="Arial" w:hAnsi="Arial" w:cs="Arial"/>
-                <w:b/>
-                <w:sz w:val="16"/>
-                <w:szCs w:val="16"/>
+                <w:sz w:val="18"/>
+                <w:szCs w:val="18"/>
+              </w:rPr>
+            </w:pPr>
+            <w:r>
+              <w:rPr>
+                <w:rFonts w:ascii="Arial" w:hAnsi="Arial" w:cs="Arial"/>
+                <w:b/>
+                <w:sz w:val="18"/>
+                <w:szCs w:val="18"/>
               </w:rPr>
               <w:t>{promedio}</w:t>
             </w:r>
@@ -3749,18 +4252,38 @@
               <w:rPr>
                 <w:rFonts w:ascii="Arial" w:hAnsi="Arial" w:cs="Arial"/>
                 <w:b/>
-                <w:sz w:val="16"/>
-                <w:szCs w:val="16"/>
-              </w:rPr>
-            </w:pPr>
-            <w:r>
-              <w:rPr>
-                <w:rFonts w:ascii="Arial" w:hAnsi="Arial" w:cs="Arial"/>
-                <w:b/>
-                <w:sz w:val="16"/>
-                <w:szCs w:val="16"/>
-              </w:rPr>
-              <w:t>{promedioL}</w:t>
+                <w:sz w:val="18"/>
+                <w:szCs w:val="18"/>
+              </w:rPr>
+            </w:pPr>
+            <w:r>
+              <w:rPr>
+                <w:rFonts w:ascii="Arial" w:hAnsi="Arial" w:cs="Arial"/>
+                <w:b/>
+                <w:sz w:val="18"/>
+                <w:szCs w:val="18"/>
+              </w:rPr>
+              <w:t>{</w:t>
+            </w:r>
+            <w:proofErr w:type="spellStart"/>
+            <w:r>
+              <w:rPr>
+                <w:rFonts w:ascii="Arial" w:hAnsi="Arial" w:cs="Arial"/>
+                <w:b/>
+                <w:sz w:val="18"/>
+                <w:szCs w:val="18"/>
+              </w:rPr>
+              <w:t>promedioL</w:t>
+            </w:r>
+            <w:proofErr w:type="spellEnd"/>
+            <w:r>
+              <w:rPr>
+                <w:rFonts w:ascii="Arial" w:hAnsi="Arial" w:cs="Arial"/>
+                <w:b/>
+                <w:sz w:val="18"/>
+                <w:szCs w:val="18"/>
+              </w:rPr>
+              <w:t>}</w:t>
             </w:r>
           </w:p>
         </w:tc>
@@ -4042,7 +4565,23 @@
           <w:sz w:val="20"/>
           <w:szCs w:val="20"/>
         </w:rPr>
-        <w:t>{lugarfecha}</w:t>
+        <w:t>{</w:t>
+      </w:r>
+      <w:proofErr w:type="spellStart"/>
+      <w:r>
+        <w:rPr>
+          <w:sz w:val="20"/>
+          <w:szCs w:val="20"/>
+        </w:rPr>
+        <w:t>lugarfecha</w:t>
+      </w:r>
+      <w:proofErr w:type="spellEnd"/>
+      <w:r>
+        <w:rPr>
+          <w:sz w:val="20"/>
+          <w:szCs w:val="20"/>
+        </w:rPr>
+        <w:t>}</w:t>
       </w:r>
     </w:p>
     <w:p>

</xml_diff>